<commit_message>
Keep the ECS vs EKS analysis in its own DAR only
The Compute DAR's Section 4.5 copied the ECS vs EKS DAR's point matrix and
feature table, and its main matrix already scored EKS, so the two
documents read as the same comparison.

Compute DAR 1.2: Section 4.5 keeps two paragraphs, a pointer to the
companion DAR and the result (ECS 4.45, EKS 3.97), with the cluster fee,
version lifecycle and low migration effort that decide it. The feature
table, the copied matrix and the cost paragraph are removed. The
Kubernetes candidate is labelled EKS on EC2 nodes in Section 3 and the
4.2 and 4.3 column headers, matching the 4.4 costing. Contents entries
from Recommendation on move up one page.

ECS vs EKS DAR 2.2: the four sentences that called its matrix identical
to Compute Section 4.5 now say the matrix is defined here. Each keeps its
length, so the pagination and contents table are unchanged.
</commit_message>
<xml_diff>
--- a/docs/dar/Utsav_eClaims_DAR_Compute.docx
+++ b/docs/dar/Utsav_eClaims_DAR_Compute.docx
@@ -1093,6 +1093,12 @@
                 <w:rFonts w:asciiTheme="majorHAnsi" w:hAnsiTheme="majorHAnsi"/>
               </w:rPr>
             </w:pPr>
+            <w:r>
+              <w:rPr>
+                <w:rFonts w:asciiTheme="majorHAnsi" w:hAnsiTheme="majorHAnsi"/>
+              </w:rPr>
+              <w:t>1.2</w:t>
+            </w:r>
           </w:p>
         </w:tc>
         <w:tc>
@@ -1112,6 +1118,12 @@
                 <w:rFonts w:asciiTheme="majorHAnsi" w:hAnsiTheme="majorHAnsi"/>
               </w:rPr>
             </w:pPr>
+            <w:r>
+              <w:rPr>
+                <w:rFonts w:asciiTheme="majorHAnsi" w:hAnsiTheme="majorHAnsi"/>
+              </w:rPr>
+              <w:t>30-10-2026</w:t>
+            </w:r>
           </w:p>
         </w:tc>
         <w:tc>
@@ -1131,6 +1143,12 @@
                 <w:rFonts w:asciiTheme="majorHAnsi" w:hAnsiTheme="majorHAnsi"/>
               </w:rPr>
             </w:pPr>
+            <w:r>
+              <w:rPr>
+                <w:rFonts w:asciiTheme="majorHAnsi" w:hAnsiTheme="majorHAnsi"/>
+              </w:rPr>
+              <w:t>Utsav Verma</w:t>
+            </w:r>
           </w:p>
         </w:tc>
         <w:tc>
@@ -1150,6 +1168,12 @@
                 <w:rFonts w:asciiTheme="majorHAnsi" w:hAnsiTheme="majorHAnsi"/>
               </w:rPr>
             </w:pPr>
+            <w:r>
+              <w:rPr>
+                <w:rFonts w:asciiTheme="majorHAnsi" w:hAnsiTheme="majorHAnsi"/>
+              </w:rPr>
+              <w:t>Section 4.5 cut to a summary of the ECS vs EKS result, the matrix and feature table being in the companion DAR; Kubernetes candidate labelled EKS on EC2 nodes in Sections 3, 4.2 and 4.3</w:t>
+            </w:r>
           </w:p>
         </w:tc>
       </w:tr>
@@ -3421,7 +3445,7 @@
                 <w:noProof/>
                 <w:webHidden/>
               </w:rPr>
-              <w:t>17</w:t>
+              <w:t>16</w:t>
             </w:r>
             <w:r>
               <w:rPr>
@@ -3511,7 +3535,7 @@
                 <w:noProof/>
                 <w:webHidden/>
               </w:rPr>
-              <w:t>19</w:t>
+              <w:t>18</w:t>
             </w:r>
             <w:r>
               <w:rPr>
@@ -3601,7 +3625,7 @@
                 <w:noProof/>
                 <w:webHidden/>
               </w:rPr>
-              <w:t>20</w:t>
+              <w:t>19</w:t>
             </w:r>
             <w:r>
               <w:rPr>
@@ -3691,7 +3715,7 @@
                 <w:noProof/>
                 <w:webHidden/>
               </w:rPr>
-              <w:t>22</w:t>
+              <w:t>21</w:t>
             </w:r>
             <w:r>
               <w:rPr>
@@ -3785,7 +3809,7 @@
                 <w:noProof/>
                 <w:webHidden/>
               </w:rPr>
-              <w:t>22</w:t>
+              <w:t>21</w:t>
             </w:r>
             <w:r>
               <w:rPr>
@@ -3879,7 +3903,7 @@
                 <w:noProof/>
                 <w:webHidden/>
               </w:rPr>
-              <w:t>22</w:t>
+              <w:t>21</w:t>
             </w:r>
             <w:r>
               <w:rPr>
@@ -4827,7 +4851,7 @@
               <w:pStyle w:val="NoSpacing"/>
             </w:pPr>
             <w:r>
-              <w:t>Kubernetes (Amazon EKS)</w:t>
+              <w:t>Kubernetes (Amazon EKS on EC2 nodes)</w:t>
             </w:r>
           </w:p>
         </w:tc>
@@ -6981,7 +7005,7 @@
               <w:rPr>
                 <w:b/>
               </w:rPr>
-              <w:t>Kubernetes (EKS)</w:t>
+              <w:t>Kubernetes (EKS on EC2 nodes)</w:t>
             </w:r>
           </w:p>
         </w:tc>
@@ -8362,7 +8386,7 @@
               <w:rPr>
                 <w:b/>
               </w:rPr>
-              <w:t>Kubernetes (EKS)</w:t>
+              <w:t>Kubernetes (EKS on EC2 nodes)</w:t>
             </w:r>
           </w:p>
         </w:tc>
@@ -10295,23 +10319,23 @@
         <w:pStyle w:val="Body"/>
       </w:pPr>
       <w:r>
-        <w:t xml:space="preserve">Sections 4.1 to 4.4 answer the major decision: which compute model. The answer is serverless containers. One narrowing question remains inside that answer, because serverless containers on AWS can be orchestrated in two ways — by Amazon ECS or by Amazon EKS, both of which support the Fargate capacity model. This is a sub-decision within the recommended option rather than a second major decision. It is </w:t>
+        <w:t xml:space="preserve">Sections 4.1 to 4.4 answer the major decision: which compute model. The answer is serverless containers. One narrowing question remains inside that answer, because two AWS services can orchestrate Fargate capacity: Amazon ECS and Amazon EKS. This is a sub-decision within the recommended option rather than a second major decision. Its full analysis — requirements, point matrix, pricing, on-premise options, sensitivity, assumptions and risks — is in the companion DAR, Container Orchestrator (Amazon ECS vs Amazon EKS), file Utsav_eClaims_DAR_ECS_vs_EKS.docx. Only its result is recorded here.</w:t>
       </w:r>
       <w:proofErr w:type="spellStart"/>
       <w:r>
-        <w:t>summarised</w:t>
+        <w:t/>
       </w:r>
       <w:proofErr w:type="spellEnd"/>
       <w:r>
-        <w:t xml:space="preserve"> here so that this document is complete. The full analysis — requirements, features and pricing, </w:t>
+        <w:t xml:space="preserve"/>
       </w:r>
       <w:proofErr w:type="gramStart"/>
       <w:r>
-        <w:t>on-premise</w:t>
+        <w:t/>
       </w:r>
       <w:proofErr w:type="gramEnd"/>
       <w:r>
-        <w:t xml:space="preserve"> options, sensitivity, assumptions and risks — is in the companion DAR, Container Orchestrator (Amazon ECS vs Amazon EKS), file Utsav_eClaims_DAR_ECS_vs_EKS.docx. Its point matrix is identical to the one below.</w:t>
+        <w:t xml:space="preserve"/>
       </w:r>
     </w:p>
     <w:p>
@@ -10319,1752 +10343,18 @@
         <w:pStyle w:val="Body"/>
       </w:pPr>
       <w:r>
-        <w:t xml:space="preserve">The attributes, weights and scores below are those of the companion DAR. </w:t>
-      </w:r>
-      <w:proofErr w:type="gramStart"/>
-      <w:r>
-        <w:t>Its Section</w:t>
-      </w:r>
-      <w:proofErr w:type="gramEnd"/>
-      <w:r>
-        <w:t xml:space="preserve"> 4.1 defines each attribute, traces each weight to an </w:t>
+        <w:t xml:space="preserve">ECS is preferred, scoring 4.45 against 3.97 for EKS. Both run the same tasks on the same Fargate capacity at the same rates, so they do not differ on self-restart, autoscaling or latency. They differ in what each asks YCompany to own: EKS adds a control-plane fee of about USD 292 a month across the four clusters, a Kubernetes version to upgrade in each cluster about every four months, and a second access model, in return for portability and control that Phase 1 does not need. That is the trade-off of Section 4.2 again, resolved the same way. The preference rests in part on the migration effort away from ECS being low: the container images and application code are unchanged, and only the service definitions are rewritten as Kubernetes manifests. Section 5 relies on the same property for the on-premise fallback.</w:t>
       </w:r>
       <w:proofErr w:type="spellStart"/>
       <w:r>
-        <w:t>eClaims</w:t>
+        <w:t/>
       </w:r>
       <w:proofErr w:type="spellEnd"/>
       <w:r>
-        <w:t xml:space="preserve"> requirement and explains each score. The two services are compared on cost, maintainability, flexibility, security, portability, control and complexity. The execution requirements — self-restart, autoscaling and latency — do not separate them, because both run the same tasks on the same Fargate capacity.</w:t>
-      </w:r>
-    </w:p>
-    <w:tbl>
-      <w:tblPr>
-        <w:tblStyle w:val="TableGrid"/>
-        <w:tblW w:w="9026" w:type="dxa"/>
-        <w:tblBorders>
-          <w:top w:val="dotted" w:sz="4" w:space="0" w:color="auto"/>
-          <w:left w:val="dotted" w:sz="4" w:space="0" w:color="auto"/>
-          <w:bottom w:val="dotted" w:sz="4" w:space="0" w:color="auto"/>
-          <w:right w:val="dotted" w:sz="4" w:space="0" w:color="auto"/>
-          <w:insideH w:val="dotted" w:sz="4" w:space="0" w:color="auto"/>
-          <w:insideV w:val="dotted" w:sz="4" w:space="0" w:color="auto"/>
-        </w:tblBorders>
-        <w:tblLook w:val="04A0" w:firstRow="1" w:lastRow="0" w:firstColumn="1" w:lastColumn="0" w:noHBand="0" w:noVBand="1"/>
-      </w:tblPr>
-      <w:tblGrid>
-        <w:gridCol w:w="2083"/>
-        <w:gridCol w:w="3472"/>
-        <w:gridCol w:w="3471"/>
-      </w:tblGrid>
-      <w:tr>
-        <w:trPr>
-          <w:cantSplit/>
-          <w:tblHeader/>
-        </w:trPr>
-        <w:tc>
-          <w:tcPr>
-            <w:tcW w:w="2083" w:type="dxa"/>
-            <w:tcBorders>
-              <w:top w:val="dotted" w:sz="4" w:space="0" w:color="auto"/>
-              <w:left w:val="dotted" w:sz="4" w:space="0" w:color="auto"/>
-              <w:bottom w:val="dotted" w:sz="4" w:space="0" w:color="auto"/>
-              <w:right w:val="dotted" w:sz="4" w:space="0" w:color="auto"/>
-            </w:tcBorders>
-            <w:shd w:val="pct5" w:color="auto" w:fill="auto"/>
-          </w:tcPr>
-          <w:p>
-            <w:pPr>
-              <w:pStyle w:val="NoSpacing"/>
-            </w:pPr>
-          </w:p>
-        </w:tc>
-        <w:tc>
-          <w:tcPr>
-            <w:tcW w:w="3472" w:type="dxa"/>
-            <w:tcBorders>
-              <w:top w:val="dotted" w:sz="4" w:space="0" w:color="auto"/>
-              <w:left w:val="dotted" w:sz="4" w:space="0" w:color="auto"/>
-              <w:bottom w:val="dotted" w:sz="4" w:space="0" w:color="auto"/>
-              <w:right w:val="dotted" w:sz="4" w:space="0" w:color="auto"/>
-            </w:tcBorders>
-            <w:shd w:val="pct5" w:color="auto" w:fill="auto"/>
-          </w:tcPr>
-          <w:p>
-            <w:pPr>
-              <w:pStyle w:val="NoSpacing"/>
-            </w:pPr>
-            <w:r>
-              <w:rPr>
-                <w:b/>
-              </w:rPr>
-              <w:t>Amazon ECS</w:t>
-            </w:r>
-          </w:p>
-        </w:tc>
-        <w:tc>
-          <w:tcPr>
-            <w:tcW w:w="3471" w:type="dxa"/>
-            <w:tcBorders>
-              <w:top w:val="dotted" w:sz="4" w:space="0" w:color="auto"/>
-              <w:left w:val="dotted" w:sz="4" w:space="0" w:color="auto"/>
-              <w:bottom w:val="dotted" w:sz="4" w:space="0" w:color="auto"/>
-              <w:right w:val="dotted" w:sz="4" w:space="0" w:color="auto"/>
-            </w:tcBorders>
-            <w:shd w:val="pct5" w:color="auto" w:fill="auto"/>
-          </w:tcPr>
-          <w:p>
-            <w:pPr>
-              <w:pStyle w:val="NoSpacing"/>
-            </w:pPr>
-            <w:r>
-              <w:rPr>
-                <w:b/>
-              </w:rPr>
-              <w:t>Amazon EKS</w:t>
-            </w:r>
-          </w:p>
-        </w:tc>
-      </w:tr>
-      <w:tr>
-        <w:trPr>
-          <w:cantSplit/>
-        </w:trPr>
-        <w:tc>
-          <w:tcPr>
-            <w:tcW w:w="2083" w:type="dxa"/>
-            <w:tcBorders>
-              <w:top w:val="dotted" w:sz="4" w:space="0" w:color="auto"/>
-              <w:left w:val="dotted" w:sz="4" w:space="0" w:color="auto"/>
-              <w:bottom w:val="dotted" w:sz="4" w:space="0" w:color="auto"/>
-              <w:right w:val="dotted" w:sz="4" w:space="0" w:color="auto"/>
-            </w:tcBorders>
-          </w:tcPr>
-          <w:p>
-            <w:pPr>
-              <w:pStyle w:val="NoSpacing"/>
-            </w:pPr>
-            <w:r>
-              <w:t>Cost</w:t>
-            </w:r>
-          </w:p>
-        </w:tc>
-        <w:tc>
-          <w:tcPr>
-            <w:tcW w:w="3472" w:type="dxa"/>
-            <w:tcBorders>
-              <w:top w:val="dotted" w:sz="4" w:space="0" w:color="auto"/>
-              <w:left w:val="dotted" w:sz="4" w:space="0" w:color="auto"/>
-              <w:bottom w:val="dotted" w:sz="4" w:space="0" w:color="auto"/>
-              <w:right w:val="dotted" w:sz="4" w:space="0" w:color="auto"/>
-            </w:tcBorders>
-          </w:tcPr>
-          <w:p>
-            <w:pPr>
-              <w:pStyle w:val="NoSpacing"/>
-            </w:pPr>
-            <w:r>
-              <w:t>Less — no control-plane charge</w:t>
-            </w:r>
-          </w:p>
-        </w:tc>
-        <w:tc>
-          <w:tcPr>
-            <w:tcW w:w="3471" w:type="dxa"/>
-            <w:tcBorders>
-              <w:top w:val="dotted" w:sz="4" w:space="0" w:color="auto"/>
-              <w:left w:val="dotted" w:sz="4" w:space="0" w:color="auto"/>
-              <w:bottom w:val="dotted" w:sz="4" w:space="0" w:color="auto"/>
-              <w:right w:val="dotted" w:sz="4" w:space="0" w:color="auto"/>
-            </w:tcBorders>
-          </w:tcPr>
-          <w:p>
-            <w:pPr>
-              <w:pStyle w:val="NoSpacing"/>
-            </w:pPr>
-            <w:r>
-              <w:t>More — a per-cluster charge in addition to compute</w:t>
-            </w:r>
-          </w:p>
-        </w:tc>
-      </w:tr>
-      <w:tr>
-        <w:trPr>
-          <w:cantSplit/>
-        </w:trPr>
-        <w:tc>
-          <w:tcPr>
-            <w:tcW w:w="2083" w:type="dxa"/>
-            <w:tcBorders>
-              <w:top w:val="dotted" w:sz="4" w:space="0" w:color="auto"/>
-              <w:left w:val="dotted" w:sz="4" w:space="0" w:color="auto"/>
-              <w:bottom w:val="dotted" w:sz="4" w:space="0" w:color="auto"/>
-              <w:right w:val="dotted" w:sz="4" w:space="0" w:color="auto"/>
-            </w:tcBorders>
-          </w:tcPr>
-          <w:p>
-            <w:pPr>
-              <w:pStyle w:val="NoSpacing"/>
-            </w:pPr>
-            <w:r>
-              <w:t>Ease of use</w:t>
-            </w:r>
-          </w:p>
-        </w:tc>
-        <w:tc>
-          <w:tcPr>
-            <w:tcW w:w="3472" w:type="dxa"/>
-            <w:tcBorders>
-              <w:top w:val="dotted" w:sz="4" w:space="0" w:color="auto"/>
-              <w:left w:val="dotted" w:sz="4" w:space="0" w:color="auto"/>
-              <w:bottom w:val="dotted" w:sz="4" w:space="0" w:color="auto"/>
-              <w:right w:val="dotted" w:sz="4" w:space="0" w:color="auto"/>
-            </w:tcBorders>
-          </w:tcPr>
-          <w:p>
-            <w:pPr>
-              <w:pStyle w:val="NoSpacing"/>
-            </w:pPr>
-            <w:r>
-              <w:t>Simple; AWS-native concepts only</w:t>
-            </w:r>
-          </w:p>
-        </w:tc>
-        <w:tc>
-          <w:tcPr>
-            <w:tcW w:w="3471" w:type="dxa"/>
-            <w:tcBorders>
-              <w:top w:val="dotted" w:sz="4" w:space="0" w:color="auto"/>
-              <w:left w:val="dotted" w:sz="4" w:space="0" w:color="auto"/>
-              <w:bottom w:val="dotted" w:sz="4" w:space="0" w:color="auto"/>
-              <w:right w:val="dotted" w:sz="4" w:space="0" w:color="auto"/>
-            </w:tcBorders>
-          </w:tcPr>
-          <w:p>
-            <w:pPr>
-              <w:pStyle w:val="NoSpacing"/>
-            </w:pPr>
-            <w:r>
-              <w:t>Requires an understanding of Kubernetes</w:t>
-            </w:r>
-          </w:p>
-        </w:tc>
-      </w:tr>
-      <w:tr>
-        <w:trPr>
-          <w:cantSplit/>
-        </w:trPr>
-        <w:tc>
-          <w:tcPr>
-            <w:tcW w:w="2083" w:type="dxa"/>
-            <w:tcBorders>
-              <w:top w:val="dotted" w:sz="4" w:space="0" w:color="auto"/>
-              <w:left w:val="dotted" w:sz="4" w:space="0" w:color="auto"/>
-              <w:bottom w:val="dotted" w:sz="4" w:space="0" w:color="auto"/>
-              <w:right w:val="dotted" w:sz="4" w:space="0" w:color="auto"/>
-            </w:tcBorders>
-          </w:tcPr>
-          <w:p>
-            <w:pPr>
-              <w:pStyle w:val="NoSpacing"/>
-            </w:pPr>
-            <w:r>
-              <w:t>Maintainability</w:t>
-            </w:r>
-          </w:p>
-        </w:tc>
-        <w:tc>
-          <w:tcPr>
-            <w:tcW w:w="3472" w:type="dxa"/>
-            <w:tcBorders>
-              <w:top w:val="dotted" w:sz="4" w:space="0" w:color="auto"/>
-              <w:left w:val="dotted" w:sz="4" w:space="0" w:color="auto"/>
-              <w:bottom w:val="dotted" w:sz="4" w:space="0" w:color="auto"/>
-              <w:right w:val="dotted" w:sz="4" w:space="0" w:color="auto"/>
-            </w:tcBorders>
-          </w:tcPr>
-          <w:p>
-            <w:pPr>
-              <w:pStyle w:val="NoSpacing"/>
-            </w:pPr>
-            <w:r>
-              <w:t>Fully managed AWS service; nothing to version</w:t>
-            </w:r>
-          </w:p>
-        </w:tc>
-        <w:tc>
-          <w:tcPr>
-            <w:tcW w:w="3471" w:type="dxa"/>
-            <w:tcBorders>
-              <w:top w:val="dotted" w:sz="4" w:space="0" w:color="auto"/>
-              <w:left w:val="dotted" w:sz="4" w:space="0" w:color="auto"/>
-              <w:bottom w:val="dotted" w:sz="4" w:space="0" w:color="auto"/>
-              <w:right w:val="dotted" w:sz="4" w:space="0" w:color="auto"/>
-            </w:tcBorders>
-          </w:tcPr>
-          <w:p>
-            <w:pPr>
-              <w:pStyle w:val="NoSpacing"/>
-            </w:pPr>
-            <w:r>
-              <w:t xml:space="preserve">Managed control plane, but cluster and add-on versions are the </w:t>
-            </w:r>
-            <w:proofErr w:type="gramStart"/>
-            <w:r>
-              <w:t>team’s</w:t>
-            </w:r>
-            <w:proofErr w:type="gramEnd"/>
-            <w:r>
-              <w:t xml:space="preserve"> to keep current</w:t>
-            </w:r>
-          </w:p>
-        </w:tc>
-      </w:tr>
-      <w:tr>
-        <w:trPr>
-          <w:cantSplit/>
-        </w:trPr>
-        <w:tc>
-          <w:tcPr>
-            <w:tcW w:w="2083" w:type="dxa"/>
-            <w:tcBorders>
-              <w:top w:val="dotted" w:sz="4" w:space="0" w:color="auto"/>
-              <w:left w:val="dotted" w:sz="4" w:space="0" w:color="auto"/>
-              <w:bottom w:val="dotted" w:sz="4" w:space="0" w:color="auto"/>
-              <w:right w:val="dotted" w:sz="4" w:space="0" w:color="auto"/>
-            </w:tcBorders>
-          </w:tcPr>
-          <w:p>
-            <w:pPr>
-              <w:pStyle w:val="NoSpacing"/>
-            </w:pPr>
-            <w:r>
-              <w:t>Flexibility</w:t>
-            </w:r>
-          </w:p>
-        </w:tc>
-        <w:tc>
-          <w:tcPr>
-            <w:tcW w:w="3472" w:type="dxa"/>
-            <w:tcBorders>
-              <w:top w:val="dotted" w:sz="4" w:space="0" w:color="auto"/>
-              <w:left w:val="dotted" w:sz="4" w:space="0" w:color="auto"/>
-              <w:bottom w:val="dotted" w:sz="4" w:space="0" w:color="auto"/>
-              <w:right w:val="dotted" w:sz="4" w:space="0" w:color="auto"/>
-            </w:tcBorders>
-          </w:tcPr>
-          <w:p>
-            <w:pPr>
-              <w:pStyle w:val="NoSpacing"/>
-            </w:pPr>
-            <w:r>
-              <w:t>Flexible in deployment — Fargate or EC2 capacity under the same service model</w:t>
-            </w:r>
-          </w:p>
-        </w:tc>
-        <w:tc>
-          <w:tcPr>
-            <w:tcW w:w="3471" w:type="dxa"/>
-            <w:tcBorders>
-              <w:top w:val="dotted" w:sz="4" w:space="0" w:color="auto"/>
-              <w:left w:val="dotted" w:sz="4" w:space="0" w:color="auto"/>
-              <w:bottom w:val="dotted" w:sz="4" w:space="0" w:color="auto"/>
-              <w:right w:val="dotted" w:sz="4" w:space="0" w:color="auto"/>
-            </w:tcBorders>
-          </w:tcPr>
-          <w:p>
-            <w:pPr>
-              <w:pStyle w:val="NoSpacing"/>
-            </w:pPr>
-            <w:r>
-              <w:t>Flexible in workload orchestration — a far larger primitive set</w:t>
-            </w:r>
-          </w:p>
-        </w:tc>
-      </w:tr>
-      <w:tr>
-        <w:trPr>
-          <w:cantSplit/>
-        </w:trPr>
-        <w:tc>
-          <w:tcPr>
-            <w:tcW w:w="2083" w:type="dxa"/>
-            <w:tcBorders>
-              <w:top w:val="dotted" w:sz="4" w:space="0" w:color="auto"/>
-              <w:left w:val="dotted" w:sz="4" w:space="0" w:color="auto"/>
-              <w:bottom w:val="dotted" w:sz="4" w:space="0" w:color="auto"/>
-              <w:right w:val="dotted" w:sz="4" w:space="0" w:color="auto"/>
-            </w:tcBorders>
-          </w:tcPr>
-          <w:p>
-            <w:pPr>
-              <w:pStyle w:val="NoSpacing"/>
-            </w:pPr>
-            <w:r>
-              <w:t>Security</w:t>
-            </w:r>
-          </w:p>
-        </w:tc>
-        <w:tc>
-          <w:tcPr>
-            <w:tcW w:w="3472" w:type="dxa"/>
-            <w:tcBorders>
-              <w:top w:val="dotted" w:sz="4" w:space="0" w:color="auto"/>
-              <w:left w:val="dotted" w:sz="4" w:space="0" w:color="auto"/>
-              <w:bottom w:val="dotted" w:sz="4" w:space="0" w:color="auto"/>
-              <w:right w:val="dotted" w:sz="4" w:space="0" w:color="auto"/>
-            </w:tcBorders>
-          </w:tcPr>
-          <w:p>
-            <w:pPr>
-              <w:pStyle w:val="NoSpacing"/>
-            </w:pPr>
-            <w:r>
-              <w:t>Deeply integrated with IAM, Secrets Manager and KMS; an IAM role per task</w:t>
-            </w:r>
-          </w:p>
-        </w:tc>
-        <w:tc>
-          <w:tcPr>
-            <w:tcW w:w="3471" w:type="dxa"/>
-            <w:tcBorders>
-              <w:top w:val="dotted" w:sz="4" w:space="0" w:color="auto"/>
-              <w:left w:val="dotted" w:sz="4" w:space="0" w:color="auto"/>
-              <w:bottom w:val="dotted" w:sz="4" w:space="0" w:color="auto"/>
-              <w:right w:val="dotted" w:sz="4" w:space="0" w:color="auto"/>
-            </w:tcBorders>
-          </w:tcPr>
-          <w:p>
-            <w:pPr>
-              <w:pStyle w:val="NoSpacing"/>
-            </w:pPr>
-            <w:r>
-              <w:t>IAM roles for service accounts, namespaces, and third-party components for parts of the estate</w:t>
-            </w:r>
-          </w:p>
-        </w:tc>
-      </w:tr>
-      <w:tr>
-        <w:trPr>
-          <w:cantSplit/>
-        </w:trPr>
-        <w:tc>
-          <w:tcPr>
-            <w:tcW w:w="2083" w:type="dxa"/>
-            <w:tcBorders>
-              <w:top w:val="dotted" w:sz="4" w:space="0" w:color="auto"/>
-              <w:left w:val="dotted" w:sz="4" w:space="0" w:color="auto"/>
-              <w:bottom w:val="dotted" w:sz="4" w:space="0" w:color="auto"/>
-              <w:right w:val="dotted" w:sz="4" w:space="0" w:color="auto"/>
-            </w:tcBorders>
-          </w:tcPr>
-          <w:p>
-            <w:pPr>
-              <w:pStyle w:val="NoSpacing"/>
-            </w:pPr>
-            <w:r>
-              <w:t>Portability</w:t>
-            </w:r>
-          </w:p>
-        </w:tc>
-        <w:tc>
-          <w:tcPr>
-            <w:tcW w:w="3472" w:type="dxa"/>
-            <w:tcBorders>
-              <w:top w:val="dotted" w:sz="4" w:space="0" w:color="auto"/>
-              <w:left w:val="dotted" w:sz="4" w:space="0" w:color="auto"/>
-              <w:bottom w:val="dotted" w:sz="4" w:space="0" w:color="auto"/>
-              <w:right w:val="dotted" w:sz="4" w:space="0" w:color="auto"/>
-            </w:tcBorders>
-          </w:tcPr>
-          <w:p>
-            <w:pPr>
-              <w:pStyle w:val="NoSpacing"/>
-            </w:pPr>
-            <w:r>
-              <w:t xml:space="preserve">Can be ported with a modest migration effort; the image is </w:t>
-            </w:r>
-            <w:proofErr w:type="gramStart"/>
-            <w:r>
-              <w:t>portable,</w:t>
-            </w:r>
-            <w:proofErr w:type="gramEnd"/>
-            <w:r>
-              <w:t xml:space="preserve"> the service definition is not</w:t>
-            </w:r>
-          </w:p>
-        </w:tc>
-        <w:tc>
-          <w:tcPr>
-            <w:tcW w:w="3471" w:type="dxa"/>
-            <w:tcBorders>
-              <w:top w:val="dotted" w:sz="4" w:space="0" w:color="auto"/>
-              <w:left w:val="dotted" w:sz="4" w:space="0" w:color="auto"/>
-              <w:bottom w:val="dotted" w:sz="4" w:space="0" w:color="auto"/>
-              <w:right w:val="dotted" w:sz="4" w:space="0" w:color="auto"/>
-            </w:tcBorders>
-          </w:tcPr>
-          <w:p>
-            <w:pPr>
-              <w:pStyle w:val="NoSpacing"/>
-            </w:pPr>
-            <w:r>
-              <w:t>Greater portability — manifests run on any conformant Kubernetes</w:t>
-            </w:r>
-          </w:p>
-        </w:tc>
-      </w:tr>
-      <w:tr>
-        <w:trPr>
-          <w:cantSplit/>
-        </w:trPr>
-        <w:tc>
-          <w:tcPr>
-            <w:tcW w:w="2083" w:type="dxa"/>
-            <w:tcBorders>
-              <w:top w:val="dotted" w:sz="4" w:space="0" w:color="auto"/>
-              <w:left w:val="dotted" w:sz="4" w:space="0" w:color="auto"/>
-              <w:bottom w:val="dotted" w:sz="4" w:space="0" w:color="auto"/>
-              <w:right w:val="dotted" w:sz="4" w:space="0" w:color="auto"/>
-            </w:tcBorders>
-          </w:tcPr>
-          <w:p>
-            <w:pPr>
-              <w:pStyle w:val="NoSpacing"/>
-            </w:pPr>
-            <w:r>
-              <w:t>Scaling</w:t>
-            </w:r>
-          </w:p>
-        </w:tc>
-        <w:tc>
-          <w:tcPr>
-            <w:tcW w:w="3472" w:type="dxa"/>
-            <w:tcBorders>
-              <w:top w:val="dotted" w:sz="4" w:space="0" w:color="auto"/>
-              <w:left w:val="dotted" w:sz="4" w:space="0" w:color="auto"/>
-              <w:bottom w:val="dotted" w:sz="4" w:space="0" w:color="auto"/>
-              <w:right w:val="dotted" w:sz="4" w:space="0" w:color="auto"/>
-            </w:tcBorders>
-          </w:tcPr>
-          <w:p>
-            <w:pPr>
-              <w:pStyle w:val="NoSpacing"/>
-            </w:pPr>
-            <w:r>
-              <w:t>Service autoscaling on target-tracking and step policies</w:t>
-            </w:r>
-          </w:p>
-        </w:tc>
-        <w:tc>
-          <w:tcPr>
-            <w:tcW w:w="3471" w:type="dxa"/>
-            <w:tcBorders>
-              <w:top w:val="dotted" w:sz="4" w:space="0" w:color="auto"/>
-              <w:left w:val="dotted" w:sz="4" w:space="0" w:color="auto"/>
-              <w:bottom w:val="dotted" w:sz="4" w:space="0" w:color="auto"/>
-              <w:right w:val="dotted" w:sz="4" w:space="0" w:color="auto"/>
-            </w:tcBorders>
-          </w:tcPr>
-          <w:p>
-            <w:pPr>
-              <w:pStyle w:val="NoSpacing"/>
-            </w:pPr>
-            <w:r>
-              <w:t xml:space="preserve">Horizontal pod </w:t>
-            </w:r>
-            <w:proofErr w:type="spellStart"/>
-            <w:r>
-              <w:t>autoscaler</w:t>
-            </w:r>
-            <w:proofErr w:type="spellEnd"/>
-            <w:r>
-              <w:t xml:space="preserve">, with a cluster </w:t>
-            </w:r>
-            <w:proofErr w:type="spellStart"/>
-            <w:r>
-              <w:t>autoscaler</w:t>
-            </w:r>
-            <w:proofErr w:type="spellEnd"/>
-            <w:r>
-              <w:t xml:space="preserve"> beneath it</w:t>
-            </w:r>
-          </w:p>
-        </w:tc>
-      </w:tr>
-      <w:tr>
-        <w:trPr>
-          <w:cantSplit/>
-        </w:trPr>
-        <w:tc>
-          <w:tcPr>
-            <w:tcW w:w="2083" w:type="dxa"/>
-            <w:tcBorders>
-              <w:top w:val="dotted" w:sz="4" w:space="0" w:color="auto"/>
-              <w:left w:val="dotted" w:sz="4" w:space="0" w:color="auto"/>
-              <w:bottom w:val="dotted" w:sz="4" w:space="0" w:color="auto"/>
-              <w:right w:val="dotted" w:sz="4" w:space="0" w:color="auto"/>
-            </w:tcBorders>
-          </w:tcPr>
-          <w:p>
-            <w:pPr>
-              <w:pStyle w:val="NoSpacing"/>
-            </w:pPr>
-            <w:r>
-              <w:t>Community</w:t>
-            </w:r>
-          </w:p>
-        </w:tc>
-        <w:tc>
-          <w:tcPr>
-            <w:tcW w:w="3472" w:type="dxa"/>
-            <w:tcBorders>
-              <w:top w:val="dotted" w:sz="4" w:space="0" w:color="auto"/>
-              <w:left w:val="dotted" w:sz="4" w:space="0" w:color="auto"/>
-              <w:bottom w:val="dotted" w:sz="4" w:space="0" w:color="auto"/>
-              <w:right w:val="dotted" w:sz="4" w:space="0" w:color="auto"/>
-            </w:tcBorders>
-          </w:tcPr>
-          <w:p>
-            <w:pPr>
-              <w:pStyle w:val="NoSpacing"/>
-            </w:pPr>
-            <w:r>
-              <w:t>Growing, AWS-</w:t>
-            </w:r>
-            <w:proofErr w:type="spellStart"/>
-            <w:r>
-              <w:t>centred</w:t>
-            </w:r>
-            <w:proofErr w:type="spellEnd"/>
-          </w:p>
-        </w:tc>
-        <w:tc>
-          <w:tcPr>
-            <w:tcW w:w="3471" w:type="dxa"/>
-            <w:tcBorders>
-              <w:top w:val="dotted" w:sz="4" w:space="0" w:color="auto"/>
-              <w:left w:val="dotted" w:sz="4" w:space="0" w:color="auto"/>
-              <w:bottom w:val="dotted" w:sz="4" w:space="0" w:color="auto"/>
-              <w:right w:val="dotted" w:sz="4" w:space="0" w:color="auto"/>
-            </w:tcBorders>
-          </w:tcPr>
-          <w:p>
-            <w:pPr>
-              <w:pStyle w:val="NoSpacing"/>
-            </w:pPr>
-            <w:r>
-              <w:t>Benefits from the whole Kubernetes ecosystem</w:t>
-            </w:r>
-          </w:p>
-        </w:tc>
-      </w:tr>
-      <w:tr>
-        <w:trPr>
-          <w:cantSplit/>
-        </w:trPr>
-        <w:tc>
-          <w:tcPr>
-            <w:tcW w:w="2083" w:type="dxa"/>
-            <w:tcBorders>
-              <w:top w:val="dotted" w:sz="4" w:space="0" w:color="auto"/>
-              <w:left w:val="dotted" w:sz="4" w:space="0" w:color="auto"/>
-              <w:bottom w:val="dotted" w:sz="4" w:space="0" w:color="auto"/>
-              <w:right w:val="dotted" w:sz="4" w:space="0" w:color="auto"/>
-            </w:tcBorders>
-          </w:tcPr>
-          <w:p>
-            <w:pPr>
-              <w:pStyle w:val="NoSpacing"/>
-            </w:pPr>
-            <w:r>
-              <w:t>Control</w:t>
-            </w:r>
-          </w:p>
-        </w:tc>
-        <w:tc>
-          <w:tcPr>
-            <w:tcW w:w="3472" w:type="dxa"/>
-            <w:tcBorders>
-              <w:top w:val="dotted" w:sz="4" w:space="0" w:color="auto"/>
-              <w:left w:val="dotted" w:sz="4" w:space="0" w:color="auto"/>
-              <w:bottom w:val="dotted" w:sz="4" w:space="0" w:color="auto"/>
-              <w:right w:val="dotted" w:sz="4" w:space="0" w:color="auto"/>
-            </w:tcBorders>
-          </w:tcPr>
-          <w:p>
-            <w:pPr>
-              <w:pStyle w:val="NoSpacing"/>
-            </w:pPr>
-            <w:r>
-              <w:t>Less — the platform decides more</w:t>
-            </w:r>
-          </w:p>
-        </w:tc>
-        <w:tc>
-          <w:tcPr>
-            <w:tcW w:w="3471" w:type="dxa"/>
-            <w:tcBorders>
-              <w:top w:val="dotted" w:sz="4" w:space="0" w:color="auto"/>
-              <w:left w:val="dotted" w:sz="4" w:space="0" w:color="auto"/>
-              <w:bottom w:val="dotted" w:sz="4" w:space="0" w:color="auto"/>
-              <w:right w:val="dotted" w:sz="4" w:space="0" w:color="auto"/>
-            </w:tcBorders>
-          </w:tcPr>
-          <w:p>
-            <w:pPr>
-              <w:pStyle w:val="NoSpacing"/>
-            </w:pPr>
-            <w:r>
-              <w:t>More — scheduling, placement and policy are all configurable</w:t>
-            </w:r>
-          </w:p>
-        </w:tc>
-      </w:tr>
-      <w:tr>
-        <w:trPr>
-          <w:cantSplit/>
-        </w:trPr>
-        <w:tc>
-          <w:tcPr>
-            <w:tcW w:w="2083" w:type="dxa"/>
-            <w:tcBorders>
-              <w:top w:val="dotted" w:sz="4" w:space="0" w:color="auto"/>
-              <w:left w:val="dotted" w:sz="4" w:space="0" w:color="auto"/>
-              <w:bottom w:val="dotted" w:sz="4" w:space="0" w:color="auto"/>
-              <w:right w:val="dotted" w:sz="4" w:space="0" w:color="auto"/>
-            </w:tcBorders>
-          </w:tcPr>
-          <w:p>
-            <w:pPr>
-              <w:pStyle w:val="NoSpacing"/>
-            </w:pPr>
-            <w:r>
-              <w:t xml:space="preserve">Resource </w:t>
-            </w:r>
-            <w:proofErr w:type="spellStart"/>
-            <w:r>
-              <w:t>utilisation</w:t>
-            </w:r>
-            <w:proofErr w:type="spellEnd"/>
-          </w:p>
-        </w:tc>
-        <w:tc>
-          <w:tcPr>
-            <w:tcW w:w="3472" w:type="dxa"/>
-            <w:tcBorders>
-              <w:top w:val="dotted" w:sz="4" w:space="0" w:color="auto"/>
-              <w:left w:val="dotted" w:sz="4" w:space="0" w:color="auto"/>
-              <w:bottom w:val="dotted" w:sz="4" w:space="0" w:color="auto"/>
-              <w:right w:val="dotted" w:sz="4" w:space="0" w:color="auto"/>
-            </w:tcBorders>
-          </w:tcPr>
-          <w:p>
-            <w:pPr>
-              <w:pStyle w:val="NoSpacing"/>
-            </w:pPr>
-            <w:r>
-              <w:t>Efficient at the task level; no bin packing to tune</w:t>
-            </w:r>
-          </w:p>
-        </w:tc>
-        <w:tc>
-          <w:tcPr>
-            <w:tcW w:w="3471" w:type="dxa"/>
-            <w:tcBorders>
-              <w:top w:val="dotted" w:sz="4" w:space="0" w:color="auto"/>
-              <w:left w:val="dotted" w:sz="4" w:space="0" w:color="auto"/>
-              <w:bottom w:val="dotted" w:sz="4" w:space="0" w:color="auto"/>
-              <w:right w:val="dotted" w:sz="4" w:space="0" w:color="auto"/>
-            </w:tcBorders>
-          </w:tcPr>
-          <w:p>
-            <w:pPr>
-              <w:pStyle w:val="NoSpacing"/>
-            </w:pPr>
-            <w:r>
-              <w:t>More granular control through requests, limits and affinity</w:t>
-            </w:r>
-          </w:p>
-        </w:tc>
-      </w:tr>
-      <w:tr>
-        <w:trPr>
-          <w:cantSplit/>
-        </w:trPr>
-        <w:tc>
-          <w:tcPr>
-            <w:tcW w:w="2083" w:type="dxa"/>
-            <w:tcBorders>
-              <w:top w:val="dotted" w:sz="4" w:space="0" w:color="auto"/>
-              <w:left w:val="dotted" w:sz="4" w:space="0" w:color="auto"/>
-              <w:bottom w:val="dotted" w:sz="4" w:space="0" w:color="auto"/>
-              <w:right w:val="dotted" w:sz="4" w:space="0" w:color="auto"/>
-            </w:tcBorders>
-          </w:tcPr>
-          <w:p>
-            <w:pPr>
-              <w:pStyle w:val="NoSpacing"/>
-            </w:pPr>
-            <w:r>
-              <w:t>Monitoring and logging</w:t>
-            </w:r>
-          </w:p>
-        </w:tc>
-        <w:tc>
-          <w:tcPr>
-            <w:tcW w:w="3472" w:type="dxa"/>
-            <w:tcBorders>
-              <w:top w:val="dotted" w:sz="4" w:space="0" w:color="auto"/>
-              <w:left w:val="dotted" w:sz="4" w:space="0" w:color="auto"/>
-              <w:bottom w:val="dotted" w:sz="4" w:space="0" w:color="auto"/>
-              <w:right w:val="dotted" w:sz="4" w:space="0" w:color="auto"/>
-            </w:tcBorders>
-          </w:tcPr>
-          <w:p>
-            <w:pPr>
-              <w:pStyle w:val="NoSpacing"/>
-            </w:pPr>
-            <w:r>
-              <w:t>Native CloudWatch and Container Insights integration</w:t>
-            </w:r>
-          </w:p>
-        </w:tc>
-        <w:tc>
-          <w:tcPr>
-            <w:tcW w:w="3471" w:type="dxa"/>
-            <w:tcBorders>
-              <w:top w:val="dotted" w:sz="4" w:space="0" w:color="auto"/>
-              <w:left w:val="dotted" w:sz="4" w:space="0" w:color="auto"/>
-              <w:bottom w:val="dotted" w:sz="4" w:space="0" w:color="auto"/>
-              <w:right w:val="dotted" w:sz="4" w:space="0" w:color="auto"/>
-            </w:tcBorders>
-          </w:tcPr>
-          <w:p>
-            <w:pPr>
-              <w:pStyle w:val="NoSpacing"/>
-            </w:pPr>
-            <w:r>
-              <w:t>Effective, but the stack is deployed and operated by the team</w:t>
-            </w:r>
-          </w:p>
-        </w:tc>
-      </w:tr>
-      <w:tr>
-        <w:trPr>
-          <w:cantSplit/>
-        </w:trPr>
-        <w:tc>
-          <w:tcPr>
-            <w:tcW w:w="2083" w:type="dxa"/>
-            <w:tcBorders>
-              <w:top w:val="dotted" w:sz="4" w:space="0" w:color="auto"/>
-              <w:left w:val="dotted" w:sz="4" w:space="0" w:color="auto"/>
-              <w:bottom w:val="dotted" w:sz="4" w:space="0" w:color="auto"/>
-              <w:right w:val="dotted" w:sz="4" w:space="0" w:color="auto"/>
-            </w:tcBorders>
-          </w:tcPr>
-          <w:p>
-            <w:pPr>
-              <w:pStyle w:val="NoSpacing"/>
-            </w:pPr>
-            <w:r>
-              <w:t>Learning curve</w:t>
-            </w:r>
-          </w:p>
-        </w:tc>
-        <w:tc>
-          <w:tcPr>
-            <w:tcW w:w="3472" w:type="dxa"/>
-            <w:tcBorders>
-              <w:top w:val="dotted" w:sz="4" w:space="0" w:color="auto"/>
-              <w:left w:val="dotted" w:sz="4" w:space="0" w:color="auto"/>
-              <w:bottom w:val="dotted" w:sz="4" w:space="0" w:color="auto"/>
-              <w:right w:val="dotted" w:sz="4" w:space="0" w:color="auto"/>
-            </w:tcBorders>
-          </w:tcPr>
-          <w:p>
-            <w:pPr>
-              <w:pStyle w:val="NoSpacing"/>
-            </w:pPr>
-            <w:r>
-              <w:t>Low</w:t>
-            </w:r>
-          </w:p>
-        </w:tc>
-        <w:tc>
-          <w:tcPr>
-            <w:tcW w:w="3471" w:type="dxa"/>
-            <w:tcBorders>
-              <w:top w:val="dotted" w:sz="4" w:space="0" w:color="auto"/>
-              <w:left w:val="dotted" w:sz="4" w:space="0" w:color="auto"/>
-              <w:bottom w:val="dotted" w:sz="4" w:space="0" w:color="auto"/>
-              <w:right w:val="dotted" w:sz="4" w:space="0" w:color="auto"/>
-            </w:tcBorders>
-          </w:tcPr>
-          <w:p>
-            <w:pPr>
-              <w:pStyle w:val="NoSpacing"/>
-            </w:pPr>
-            <w:r>
-              <w:t>Deeper — Kubernetes first, then its ecosystem</w:t>
-            </w:r>
-          </w:p>
-        </w:tc>
-      </w:tr>
-    </w:tbl>
-    <w:p>
-      <w:pPr>
-        <w:pStyle w:val="NoSpacing"/>
-      </w:pPr>
-    </w:p>
-    <w:p>
-      <w:pPr>
-        <w:pStyle w:val="Body"/>
-      </w:pPr>
-      <w:r>
-        <w:t>Scoring seven of these attributes on the 1 to 5 scale used throughout this document:</w:t>
-      </w:r>
-    </w:p>
-    <w:tbl>
-      <w:tblPr>
-        <w:tblStyle w:val="TableGrid"/>
-        <w:tblW w:w="9026" w:type="dxa"/>
-        <w:tblBorders>
-          <w:top w:val="dotted" w:sz="4" w:space="0" w:color="auto"/>
-          <w:left w:val="dotted" w:sz="4" w:space="0" w:color="auto"/>
-          <w:bottom w:val="dotted" w:sz="4" w:space="0" w:color="auto"/>
-          <w:right w:val="dotted" w:sz="4" w:space="0" w:color="auto"/>
-          <w:insideH w:val="dotted" w:sz="4" w:space="0" w:color="auto"/>
-          <w:insideV w:val="dotted" w:sz="4" w:space="0" w:color="auto"/>
-        </w:tblBorders>
-        <w:tblLook w:val="04A0" w:firstRow="1" w:lastRow="0" w:firstColumn="1" w:lastColumn="0" w:noHBand="0" w:noVBand="1"/>
-      </w:tblPr>
-      <w:tblGrid>
-        <w:gridCol w:w="4103"/>
-        <w:gridCol w:w="1641"/>
-        <w:gridCol w:w="1641"/>
-        <w:gridCol w:w="1641"/>
-      </w:tblGrid>
-      <w:tr>
-        <w:trPr>
-          <w:cantSplit/>
-          <w:tblHeader/>
-        </w:trPr>
-        <w:tc>
-          <w:tcPr>
-            <w:tcW w:w="4103" w:type="dxa"/>
-            <w:tcBorders>
-              <w:top w:val="dotted" w:sz="4" w:space="0" w:color="auto"/>
-              <w:left w:val="dotted" w:sz="4" w:space="0" w:color="auto"/>
-              <w:bottom w:val="dotted" w:sz="4" w:space="0" w:color="auto"/>
-              <w:right w:val="dotted" w:sz="4" w:space="0" w:color="auto"/>
-            </w:tcBorders>
-            <w:shd w:val="pct5" w:color="auto" w:fill="auto"/>
-          </w:tcPr>
-          <w:p>
-            <w:pPr>
-              <w:pStyle w:val="NoSpacing"/>
-            </w:pPr>
-            <w:r>
-              <w:rPr>
-                <w:b/>
-              </w:rPr>
-              <w:t>Feature</w:t>
-            </w:r>
-          </w:p>
-        </w:tc>
-        <w:tc>
-          <w:tcPr>
-            <w:tcW w:w="1641" w:type="dxa"/>
-            <w:tcBorders>
-              <w:top w:val="dotted" w:sz="4" w:space="0" w:color="auto"/>
-              <w:left w:val="dotted" w:sz="4" w:space="0" w:color="auto"/>
-              <w:bottom w:val="dotted" w:sz="4" w:space="0" w:color="auto"/>
-              <w:right w:val="dotted" w:sz="4" w:space="0" w:color="auto"/>
-            </w:tcBorders>
-            <w:shd w:val="pct5" w:color="auto" w:fill="auto"/>
-          </w:tcPr>
-          <w:p>
-            <w:pPr>
-              <w:pStyle w:val="NoSpacing"/>
-            </w:pPr>
-            <w:r>
-              <w:rPr>
-                <w:b/>
-              </w:rPr>
-              <w:t>Weight</w:t>
-            </w:r>
-          </w:p>
-        </w:tc>
-        <w:tc>
-          <w:tcPr>
-            <w:tcW w:w="1641" w:type="dxa"/>
-            <w:tcBorders>
-              <w:top w:val="dotted" w:sz="4" w:space="0" w:color="auto"/>
-              <w:left w:val="dotted" w:sz="4" w:space="0" w:color="auto"/>
-              <w:bottom w:val="dotted" w:sz="4" w:space="0" w:color="auto"/>
-              <w:right w:val="dotted" w:sz="4" w:space="0" w:color="auto"/>
-            </w:tcBorders>
-            <w:shd w:val="pct5" w:color="auto" w:fill="auto"/>
-          </w:tcPr>
-          <w:p>
-            <w:pPr>
-              <w:pStyle w:val="NoSpacing"/>
-            </w:pPr>
-            <w:r>
-              <w:rPr>
-                <w:b/>
-              </w:rPr>
-              <w:t xml:space="preserve">Amazon ECS </w:t>
-            </w:r>
-            <w:r>
-              <w:rPr>
-                <w:rFonts w:ascii="Wingdings" w:hAnsi="Wingdings"/>
-                <w:b/>
-                <w:color w:val="00B050"/>
-                <w:sz w:val="24"/>
-                <w:szCs w:val="24"/>
-              </w:rPr>
-              <w:t></w:t>
-            </w:r>
-          </w:p>
-        </w:tc>
-        <w:tc>
-          <w:tcPr>
-            <w:tcW w:w="1641" w:type="dxa"/>
-            <w:tcBorders>
-              <w:top w:val="dotted" w:sz="4" w:space="0" w:color="auto"/>
-              <w:left w:val="dotted" w:sz="4" w:space="0" w:color="auto"/>
-              <w:bottom w:val="dotted" w:sz="4" w:space="0" w:color="auto"/>
-              <w:right w:val="dotted" w:sz="4" w:space="0" w:color="auto"/>
-            </w:tcBorders>
-            <w:shd w:val="pct5" w:color="auto" w:fill="auto"/>
-          </w:tcPr>
-          <w:p>
-            <w:pPr>
-              <w:pStyle w:val="NoSpacing"/>
-            </w:pPr>
-            <w:r>
-              <w:rPr>
-                <w:b/>
-              </w:rPr>
-              <w:t>Amazon EKS</w:t>
-            </w:r>
-          </w:p>
-        </w:tc>
-      </w:tr>
-      <w:tr>
-        <w:trPr>
-          <w:cantSplit/>
-        </w:trPr>
-        <w:tc>
-          <w:tcPr>
-            <w:tcW w:w="4103" w:type="dxa"/>
-            <w:tcBorders>
-              <w:top w:val="dotted" w:sz="4" w:space="0" w:color="auto"/>
-              <w:left w:val="dotted" w:sz="4" w:space="0" w:color="auto"/>
-              <w:bottom w:val="dotted" w:sz="4" w:space="0" w:color="auto"/>
-              <w:right w:val="dotted" w:sz="4" w:space="0" w:color="auto"/>
-            </w:tcBorders>
-          </w:tcPr>
-          <w:p>
-            <w:pPr>
-              <w:pStyle w:val="NoSpacing"/>
-            </w:pPr>
-            <w:r>
-              <w:t>Cost</w:t>
-            </w:r>
-          </w:p>
-        </w:tc>
-        <w:tc>
-          <w:tcPr>
-            <w:tcW w:w="1641" w:type="dxa"/>
-            <w:tcBorders>
-              <w:top w:val="dotted" w:sz="4" w:space="0" w:color="auto"/>
-              <w:left w:val="dotted" w:sz="4" w:space="0" w:color="auto"/>
-              <w:bottom w:val="dotted" w:sz="4" w:space="0" w:color="auto"/>
-              <w:right w:val="dotted" w:sz="4" w:space="0" w:color="auto"/>
-            </w:tcBorders>
-          </w:tcPr>
-          <w:p>
-            <w:pPr>
-              <w:pStyle w:val="NoSpacing"/>
-            </w:pPr>
-            <w:r>
-              <w:t>5</w:t>
-            </w:r>
-          </w:p>
-        </w:tc>
-        <w:tc>
-          <w:tcPr>
-            <w:tcW w:w="1641" w:type="dxa"/>
-            <w:tcBorders>
-              <w:top w:val="dotted" w:sz="4" w:space="0" w:color="auto"/>
-              <w:left w:val="dotted" w:sz="4" w:space="0" w:color="auto"/>
-              <w:bottom w:val="dotted" w:sz="4" w:space="0" w:color="auto"/>
-              <w:right w:val="dotted" w:sz="4" w:space="0" w:color="auto"/>
-            </w:tcBorders>
-          </w:tcPr>
-          <w:p>
-            <w:pPr>
-              <w:pStyle w:val="NoSpacing"/>
-            </w:pPr>
-            <w:r>
-              <w:t>5</w:t>
-            </w:r>
-          </w:p>
-        </w:tc>
-        <w:tc>
-          <w:tcPr>
-            <w:tcW w:w="1641" w:type="dxa"/>
-            <w:tcBorders>
-              <w:top w:val="dotted" w:sz="4" w:space="0" w:color="auto"/>
-              <w:left w:val="dotted" w:sz="4" w:space="0" w:color="auto"/>
-              <w:bottom w:val="dotted" w:sz="4" w:space="0" w:color="auto"/>
-              <w:right w:val="dotted" w:sz="4" w:space="0" w:color="auto"/>
-            </w:tcBorders>
-          </w:tcPr>
-          <w:p>
-            <w:pPr>
-              <w:pStyle w:val="NoSpacing"/>
-            </w:pPr>
-            <w:r>
-              <w:t>3</w:t>
-            </w:r>
-          </w:p>
-        </w:tc>
-      </w:tr>
-      <w:tr>
-        <w:trPr>
-          <w:cantSplit/>
-        </w:trPr>
-        <w:tc>
-          <w:tcPr>
-            <w:tcW w:w="4103" w:type="dxa"/>
-            <w:tcBorders>
-              <w:top w:val="dotted" w:sz="4" w:space="0" w:color="auto"/>
-              <w:left w:val="dotted" w:sz="4" w:space="0" w:color="auto"/>
-              <w:bottom w:val="dotted" w:sz="4" w:space="0" w:color="auto"/>
-              <w:right w:val="dotted" w:sz="4" w:space="0" w:color="auto"/>
-            </w:tcBorders>
-          </w:tcPr>
-          <w:p>
-            <w:pPr>
-              <w:pStyle w:val="NoSpacing"/>
-            </w:pPr>
-            <w:r>
-              <w:t>Maintainability</w:t>
-            </w:r>
-          </w:p>
-        </w:tc>
-        <w:tc>
-          <w:tcPr>
-            <w:tcW w:w="1641" w:type="dxa"/>
-            <w:tcBorders>
-              <w:top w:val="dotted" w:sz="4" w:space="0" w:color="auto"/>
-              <w:left w:val="dotted" w:sz="4" w:space="0" w:color="auto"/>
-              <w:bottom w:val="dotted" w:sz="4" w:space="0" w:color="auto"/>
-              <w:right w:val="dotted" w:sz="4" w:space="0" w:color="auto"/>
-            </w:tcBorders>
-          </w:tcPr>
-          <w:p>
-            <w:pPr>
-              <w:pStyle w:val="NoSpacing"/>
-            </w:pPr>
-            <w:r>
-              <w:t>4</w:t>
-            </w:r>
-          </w:p>
-        </w:tc>
-        <w:tc>
-          <w:tcPr>
-            <w:tcW w:w="1641" w:type="dxa"/>
-            <w:tcBorders>
-              <w:top w:val="dotted" w:sz="4" w:space="0" w:color="auto"/>
-              <w:left w:val="dotted" w:sz="4" w:space="0" w:color="auto"/>
-              <w:bottom w:val="dotted" w:sz="4" w:space="0" w:color="auto"/>
-              <w:right w:val="dotted" w:sz="4" w:space="0" w:color="auto"/>
-            </w:tcBorders>
-          </w:tcPr>
-          <w:p>
-            <w:pPr>
-              <w:pStyle w:val="NoSpacing"/>
-            </w:pPr>
-            <w:r>
-              <w:t>5</w:t>
-            </w:r>
-          </w:p>
-        </w:tc>
-        <w:tc>
-          <w:tcPr>
-            <w:tcW w:w="1641" w:type="dxa"/>
-            <w:tcBorders>
-              <w:top w:val="dotted" w:sz="4" w:space="0" w:color="auto"/>
-              <w:left w:val="dotted" w:sz="4" w:space="0" w:color="auto"/>
-              <w:bottom w:val="dotted" w:sz="4" w:space="0" w:color="auto"/>
-              <w:right w:val="dotted" w:sz="4" w:space="0" w:color="auto"/>
-            </w:tcBorders>
-          </w:tcPr>
-          <w:p>
-            <w:pPr>
-              <w:pStyle w:val="NoSpacing"/>
-            </w:pPr>
-            <w:r>
-              <w:t>4</w:t>
-            </w:r>
-          </w:p>
-        </w:tc>
-      </w:tr>
-      <w:tr>
-        <w:trPr>
-          <w:cantSplit/>
-        </w:trPr>
-        <w:tc>
-          <w:tcPr>
-            <w:tcW w:w="4103" w:type="dxa"/>
-            <w:tcBorders>
-              <w:top w:val="dotted" w:sz="4" w:space="0" w:color="auto"/>
-              <w:left w:val="dotted" w:sz="4" w:space="0" w:color="auto"/>
-              <w:bottom w:val="dotted" w:sz="4" w:space="0" w:color="auto"/>
-              <w:right w:val="dotted" w:sz="4" w:space="0" w:color="auto"/>
-            </w:tcBorders>
-          </w:tcPr>
-          <w:p>
-            <w:pPr>
-              <w:pStyle w:val="NoSpacing"/>
-            </w:pPr>
-            <w:r>
-              <w:t>Flexibility</w:t>
-            </w:r>
-          </w:p>
-        </w:tc>
-        <w:tc>
-          <w:tcPr>
-            <w:tcW w:w="1641" w:type="dxa"/>
-            <w:tcBorders>
-              <w:top w:val="dotted" w:sz="4" w:space="0" w:color="auto"/>
-              <w:left w:val="dotted" w:sz="4" w:space="0" w:color="auto"/>
-              <w:bottom w:val="dotted" w:sz="4" w:space="0" w:color="auto"/>
-              <w:right w:val="dotted" w:sz="4" w:space="0" w:color="auto"/>
-            </w:tcBorders>
-          </w:tcPr>
-          <w:p>
-            <w:pPr>
-              <w:pStyle w:val="NoSpacing"/>
-            </w:pPr>
-            <w:r>
-              <w:t>5</w:t>
-            </w:r>
-          </w:p>
-        </w:tc>
-        <w:tc>
-          <w:tcPr>
-            <w:tcW w:w="1641" w:type="dxa"/>
-            <w:tcBorders>
-              <w:top w:val="dotted" w:sz="4" w:space="0" w:color="auto"/>
-              <w:left w:val="dotted" w:sz="4" w:space="0" w:color="auto"/>
-              <w:bottom w:val="dotted" w:sz="4" w:space="0" w:color="auto"/>
-              <w:right w:val="dotted" w:sz="4" w:space="0" w:color="auto"/>
-            </w:tcBorders>
-          </w:tcPr>
-          <w:p>
-            <w:pPr>
-              <w:pStyle w:val="NoSpacing"/>
-            </w:pPr>
-            <w:r>
-              <w:t>5</w:t>
-            </w:r>
-          </w:p>
-        </w:tc>
-        <w:tc>
-          <w:tcPr>
-            <w:tcW w:w="1641" w:type="dxa"/>
-            <w:tcBorders>
-              <w:top w:val="dotted" w:sz="4" w:space="0" w:color="auto"/>
-              <w:left w:val="dotted" w:sz="4" w:space="0" w:color="auto"/>
-              <w:bottom w:val="dotted" w:sz="4" w:space="0" w:color="auto"/>
-              <w:right w:val="dotted" w:sz="4" w:space="0" w:color="auto"/>
-            </w:tcBorders>
-          </w:tcPr>
-          <w:p>
-            <w:pPr>
-              <w:pStyle w:val="NoSpacing"/>
-            </w:pPr>
-            <w:r>
-              <w:t>4</w:t>
-            </w:r>
-          </w:p>
-        </w:tc>
-      </w:tr>
-      <w:tr>
-        <w:trPr>
-          <w:cantSplit/>
-        </w:trPr>
-        <w:tc>
-          <w:tcPr>
-            <w:tcW w:w="4103" w:type="dxa"/>
-            <w:tcBorders>
-              <w:top w:val="dotted" w:sz="4" w:space="0" w:color="auto"/>
-              <w:left w:val="dotted" w:sz="4" w:space="0" w:color="auto"/>
-              <w:bottom w:val="dotted" w:sz="4" w:space="0" w:color="auto"/>
-              <w:right w:val="dotted" w:sz="4" w:space="0" w:color="auto"/>
-            </w:tcBorders>
-          </w:tcPr>
-          <w:p>
-            <w:pPr>
-              <w:pStyle w:val="NoSpacing"/>
-            </w:pPr>
-            <w:r>
-              <w:t>Security</w:t>
-            </w:r>
-          </w:p>
-        </w:tc>
-        <w:tc>
-          <w:tcPr>
-            <w:tcW w:w="1641" w:type="dxa"/>
-            <w:tcBorders>
-              <w:top w:val="dotted" w:sz="4" w:space="0" w:color="auto"/>
-              <w:left w:val="dotted" w:sz="4" w:space="0" w:color="auto"/>
-              <w:bottom w:val="dotted" w:sz="4" w:space="0" w:color="auto"/>
-              <w:right w:val="dotted" w:sz="4" w:space="0" w:color="auto"/>
-            </w:tcBorders>
-          </w:tcPr>
-          <w:p>
-            <w:pPr>
-              <w:pStyle w:val="NoSpacing"/>
-            </w:pPr>
-            <w:r>
-              <w:t>3</w:t>
-            </w:r>
-          </w:p>
-        </w:tc>
-        <w:tc>
-          <w:tcPr>
-            <w:tcW w:w="1641" w:type="dxa"/>
-            <w:tcBorders>
-              <w:top w:val="dotted" w:sz="4" w:space="0" w:color="auto"/>
-              <w:left w:val="dotted" w:sz="4" w:space="0" w:color="auto"/>
-              <w:bottom w:val="dotted" w:sz="4" w:space="0" w:color="auto"/>
-              <w:right w:val="dotted" w:sz="4" w:space="0" w:color="auto"/>
-            </w:tcBorders>
-          </w:tcPr>
-          <w:p>
-            <w:pPr>
-              <w:pStyle w:val="NoSpacing"/>
-            </w:pPr>
-            <w:r>
-              <w:t>5</w:t>
-            </w:r>
-          </w:p>
-        </w:tc>
-        <w:tc>
-          <w:tcPr>
-            <w:tcW w:w="1641" w:type="dxa"/>
-            <w:tcBorders>
-              <w:top w:val="dotted" w:sz="4" w:space="0" w:color="auto"/>
-              <w:left w:val="dotted" w:sz="4" w:space="0" w:color="auto"/>
-              <w:bottom w:val="dotted" w:sz="4" w:space="0" w:color="auto"/>
-              <w:right w:val="dotted" w:sz="4" w:space="0" w:color="auto"/>
-            </w:tcBorders>
-          </w:tcPr>
-          <w:p>
-            <w:pPr>
-              <w:pStyle w:val="NoSpacing"/>
-            </w:pPr>
-            <w:r>
-              <w:t>4</w:t>
-            </w:r>
-          </w:p>
-        </w:tc>
-      </w:tr>
-      <w:tr>
-        <w:trPr>
-          <w:cantSplit/>
-        </w:trPr>
-        <w:tc>
-          <w:tcPr>
-            <w:tcW w:w="4103" w:type="dxa"/>
-            <w:tcBorders>
-              <w:top w:val="dotted" w:sz="4" w:space="0" w:color="auto"/>
-              <w:left w:val="dotted" w:sz="4" w:space="0" w:color="auto"/>
-              <w:bottom w:val="dotted" w:sz="4" w:space="0" w:color="auto"/>
-              <w:right w:val="dotted" w:sz="4" w:space="0" w:color="auto"/>
-            </w:tcBorders>
-          </w:tcPr>
-          <w:p>
-            <w:pPr>
-              <w:pStyle w:val="NoSpacing"/>
-            </w:pPr>
-            <w:r>
-              <w:t>Portability</w:t>
-            </w:r>
-          </w:p>
-        </w:tc>
-        <w:tc>
-          <w:tcPr>
-            <w:tcW w:w="1641" w:type="dxa"/>
-            <w:tcBorders>
-              <w:top w:val="dotted" w:sz="4" w:space="0" w:color="auto"/>
-              <w:left w:val="dotted" w:sz="4" w:space="0" w:color="auto"/>
-              <w:bottom w:val="dotted" w:sz="4" w:space="0" w:color="auto"/>
-              <w:right w:val="dotted" w:sz="4" w:space="0" w:color="auto"/>
-            </w:tcBorders>
-          </w:tcPr>
-          <w:p>
-            <w:pPr>
-              <w:pStyle w:val="NoSpacing"/>
-            </w:pPr>
-            <w:r>
-              <w:t>5</w:t>
-            </w:r>
-          </w:p>
-        </w:tc>
-        <w:tc>
-          <w:tcPr>
-            <w:tcW w:w="1641" w:type="dxa"/>
-            <w:tcBorders>
-              <w:top w:val="dotted" w:sz="4" w:space="0" w:color="auto"/>
-              <w:left w:val="dotted" w:sz="4" w:space="0" w:color="auto"/>
-              <w:bottom w:val="dotted" w:sz="4" w:space="0" w:color="auto"/>
-              <w:right w:val="dotted" w:sz="4" w:space="0" w:color="auto"/>
-            </w:tcBorders>
-          </w:tcPr>
-          <w:p>
-            <w:pPr>
-              <w:pStyle w:val="NoSpacing"/>
-            </w:pPr>
-            <w:r>
-              <w:t>3</w:t>
-            </w:r>
-          </w:p>
-        </w:tc>
-        <w:tc>
-          <w:tcPr>
-            <w:tcW w:w="1641" w:type="dxa"/>
-            <w:tcBorders>
-              <w:top w:val="dotted" w:sz="4" w:space="0" w:color="auto"/>
-              <w:left w:val="dotted" w:sz="4" w:space="0" w:color="auto"/>
-              <w:bottom w:val="dotted" w:sz="4" w:space="0" w:color="auto"/>
-              <w:right w:val="dotted" w:sz="4" w:space="0" w:color="auto"/>
-            </w:tcBorders>
-          </w:tcPr>
-          <w:p>
-            <w:pPr>
-              <w:pStyle w:val="NoSpacing"/>
-            </w:pPr>
-            <w:r>
-              <w:t>5</w:t>
-            </w:r>
-          </w:p>
-        </w:tc>
-      </w:tr>
-      <w:tr>
-        <w:trPr>
-          <w:cantSplit/>
-        </w:trPr>
-        <w:tc>
-          <w:tcPr>
-            <w:tcW w:w="4103" w:type="dxa"/>
-            <w:tcBorders>
-              <w:top w:val="dotted" w:sz="4" w:space="0" w:color="auto"/>
-              <w:left w:val="dotted" w:sz="4" w:space="0" w:color="auto"/>
-              <w:bottom w:val="dotted" w:sz="4" w:space="0" w:color="auto"/>
-              <w:right w:val="dotted" w:sz="4" w:space="0" w:color="auto"/>
-            </w:tcBorders>
-          </w:tcPr>
-          <w:p>
-            <w:pPr>
-              <w:pStyle w:val="NoSpacing"/>
-            </w:pPr>
-            <w:r>
-              <w:t>Control</w:t>
-            </w:r>
-          </w:p>
-        </w:tc>
-        <w:tc>
-          <w:tcPr>
-            <w:tcW w:w="1641" w:type="dxa"/>
-            <w:tcBorders>
-              <w:top w:val="dotted" w:sz="4" w:space="0" w:color="auto"/>
-              <w:left w:val="dotted" w:sz="4" w:space="0" w:color="auto"/>
-              <w:bottom w:val="dotted" w:sz="4" w:space="0" w:color="auto"/>
-              <w:right w:val="dotted" w:sz="4" w:space="0" w:color="auto"/>
-            </w:tcBorders>
-          </w:tcPr>
-          <w:p>
-            <w:pPr>
-              <w:pStyle w:val="NoSpacing"/>
-            </w:pPr>
-            <w:r>
-              <w:t>3</w:t>
-            </w:r>
-          </w:p>
-        </w:tc>
-        <w:tc>
-          <w:tcPr>
-            <w:tcW w:w="1641" w:type="dxa"/>
-            <w:tcBorders>
-              <w:top w:val="dotted" w:sz="4" w:space="0" w:color="auto"/>
-              <w:left w:val="dotted" w:sz="4" w:space="0" w:color="auto"/>
-              <w:bottom w:val="dotted" w:sz="4" w:space="0" w:color="auto"/>
-              <w:right w:val="dotted" w:sz="4" w:space="0" w:color="auto"/>
-            </w:tcBorders>
-          </w:tcPr>
-          <w:p>
-            <w:pPr>
-              <w:pStyle w:val="NoSpacing"/>
-            </w:pPr>
-            <w:r>
-              <w:t>3</w:t>
-            </w:r>
-          </w:p>
-        </w:tc>
-        <w:tc>
-          <w:tcPr>
-            <w:tcW w:w="1641" w:type="dxa"/>
-            <w:tcBorders>
-              <w:top w:val="dotted" w:sz="4" w:space="0" w:color="auto"/>
-              <w:left w:val="dotted" w:sz="4" w:space="0" w:color="auto"/>
-              <w:bottom w:val="dotted" w:sz="4" w:space="0" w:color="auto"/>
-              <w:right w:val="dotted" w:sz="4" w:space="0" w:color="auto"/>
-            </w:tcBorders>
-          </w:tcPr>
-          <w:p>
-            <w:pPr>
-              <w:pStyle w:val="NoSpacing"/>
-            </w:pPr>
-            <w:r>
-              <w:t>5</w:t>
-            </w:r>
-          </w:p>
-        </w:tc>
-      </w:tr>
-      <w:tr>
-        <w:trPr>
-          <w:cantSplit/>
-        </w:trPr>
-        <w:tc>
-          <w:tcPr>
-            <w:tcW w:w="4103" w:type="dxa"/>
-            <w:tcBorders>
-              <w:top w:val="dotted" w:sz="4" w:space="0" w:color="auto"/>
-              <w:left w:val="dotted" w:sz="4" w:space="0" w:color="auto"/>
-              <w:bottom w:val="dotted" w:sz="4" w:space="0" w:color="auto"/>
-              <w:right w:val="dotted" w:sz="4" w:space="0" w:color="auto"/>
-            </w:tcBorders>
-          </w:tcPr>
-          <w:p>
-            <w:pPr>
-              <w:pStyle w:val="NoSpacing"/>
-            </w:pPr>
-            <w:r>
-              <w:t>Complexity (5 = simplest)</w:t>
-            </w:r>
-          </w:p>
-        </w:tc>
-        <w:tc>
-          <w:tcPr>
-            <w:tcW w:w="1641" w:type="dxa"/>
-            <w:tcBorders>
-              <w:top w:val="dotted" w:sz="4" w:space="0" w:color="auto"/>
-              <w:left w:val="dotted" w:sz="4" w:space="0" w:color="auto"/>
-              <w:bottom w:val="dotted" w:sz="4" w:space="0" w:color="auto"/>
-              <w:right w:val="dotted" w:sz="4" w:space="0" w:color="auto"/>
-            </w:tcBorders>
-          </w:tcPr>
-          <w:p>
-            <w:pPr>
-              <w:pStyle w:val="NoSpacing"/>
-            </w:pPr>
-            <w:r>
-              <w:t>4</w:t>
-            </w:r>
-          </w:p>
-        </w:tc>
-        <w:tc>
-          <w:tcPr>
-            <w:tcW w:w="1641" w:type="dxa"/>
-            <w:tcBorders>
-              <w:top w:val="dotted" w:sz="4" w:space="0" w:color="auto"/>
-              <w:left w:val="dotted" w:sz="4" w:space="0" w:color="auto"/>
-              <w:bottom w:val="dotted" w:sz="4" w:space="0" w:color="auto"/>
-              <w:right w:val="dotted" w:sz="4" w:space="0" w:color="auto"/>
-            </w:tcBorders>
-          </w:tcPr>
-          <w:p>
-            <w:pPr>
-              <w:pStyle w:val="NoSpacing"/>
-            </w:pPr>
-            <w:r>
-              <w:t>5</w:t>
-            </w:r>
-          </w:p>
-        </w:tc>
-        <w:tc>
-          <w:tcPr>
-            <w:tcW w:w="1641" w:type="dxa"/>
-            <w:tcBorders>
-              <w:top w:val="dotted" w:sz="4" w:space="0" w:color="auto"/>
-              <w:left w:val="dotted" w:sz="4" w:space="0" w:color="auto"/>
-              <w:bottom w:val="dotted" w:sz="4" w:space="0" w:color="auto"/>
-              <w:right w:val="dotted" w:sz="4" w:space="0" w:color="auto"/>
-            </w:tcBorders>
-          </w:tcPr>
-          <w:p>
-            <w:pPr>
-              <w:pStyle w:val="NoSpacing"/>
-            </w:pPr>
-            <w:r>
-              <w:t>3</w:t>
-            </w:r>
-          </w:p>
-        </w:tc>
-      </w:tr>
-      <w:tr>
-        <w:trPr>
-          <w:cantSplit/>
-        </w:trPr>
-        <w:tc>
-          <w:tcPr>
-            <w:tcW w:w="4103" w:type="dxa"/>
-            <w:tcBorders>
-              <w:top w:val="dotted" w:sz="4" w:space="0" w:color="auto"/>
-              <w:left w:val="dotted" w:sz="4" w:space="0" w:color="auto"/>
-              <w:bottom w:val="dotted" w:sz="4" w:space="0" w:color="auto"/>
-              <w:right w:val="dotted" w:sz="4" w:space="0" w:color="auto"/>
-            </w:tcBorders>
-          </w:tcPr>
-          <w:p>
-            <w:pPr>
-              <w:pStyle w:val="NoSpacing"/>
-            </w:pPr>
-            <w:r>
-              <w:rPr>
-                <w:b/>
-              </w:rPr>
-              <w:t>Total Weighted Score</w:t>
-            </w:r>
-          </w:p>
-        </w:tc>
-        <w:tc>
-          <w:tcPr>
-            <w:tcW w:w="1641" w:type="dxa"/>
-            <w:tcBorders>
-              <w:top w:val="dotted" w:sz="4" w:space="0" w:color="auto"/>
-              <w:left w:val="dotted" w:sz="4" w:space="0" w:color="auto"/>
-              <w:bottom w:val="dotted" w:sz="4" w:space="0" w:color="auto"/>
-              <w:right w:val="dotted" w:sz="4" w:space="0" w:color="auto"/>
-            </w:tcBorders>
-          </w:tcPr>
-          <w:p>
-            <w:pPr>
-              <w:pStyle w:val="NoSpacing"/>
-            </w:pPr>
-            <w:r>
-              <w:rPr>
-                <w:b/>
-              </w:rPr>
-              <w:t>29</w:t>
-            </w:r>
-          </w:p>
-        </w:tc>
-        <w:tc>
-          <w:tcPr>
-            <w:tcW w:w="1641" w:type="dxa"/>
-            <w:tcBorders>
-              <w:top w:val="dotted" w:sz="4" w:space="0" w:color="auto"/>
-              <w:left w:val="dotted" w:sz="4" w:space="0" w:color="auto"/>
-              <w:bottom w:val="dotted" w:sz="4" w:space="0" w:color="auto"/>
-              <w:right w:val="dotted" w:sz="4" w:space="0" w:color="auto"/>
-            </w:tcBorders>
-          </w:tcPr>
-          <w:p>
-            <w:pPr>
-              <w:pStyle w:val="NoSpacing"/>
-            </w:pPr>
-            <w:r>
-              <w:rPr>
-                <w:b/>
-              </w:rPr>
-              <w:t>4.45 / 5</w:t>
-            </w:r>
-          </w:p>
-        </w:tc>
-        <w:tc>
-          <w:tcPr>
-            <w:tcW w:w="1641" w:type="dxa"/>
-            <w:tcBorders>
-              <w:top w:val="dotted" w:sz="4" w:space="0" w:color="auto"/>
-              <w:left w:val="dotted" w:sz="4" w:space="0" w:color="auto"/>
-              <w:bottom w:val="dotted" w:sz="4" w:space="0" w:color="auto"/>
-              <w:right w:val="dotted" w:sz="4" w:space="0" w:color="auto"/>
-            </w:tcBorders>
-          </w:tcPr>
-          <w:p>
-            <w:pPr>
-              <w:pStyle w:val="NoSpacing"/>
-            </w:pPr>
-            <w:r>
-              <w:rPr>
-                <w:b/>
-              </w:rPr>
-              <w:t>3.97 / 5</w:t>
-            </w:r>
-          </w:p>
-        </w:tc>
-      </w:tr>
-    </w:tbl>
-    <w:p>
-      <w:pPr>
-        <w:pStyle w:val="NoSpacing"/>
-      </w:pPr>
-    </w:p>
-    <w:p>
-      <w:pPr>
-        <w:pStyle w:val="Body"/>
-      </w:pPr>
-      <w:r>
-        <w:t xml:space="preserve">ECS leads at 4.45 against 3.97. The reasons are lower cost, less to maintain, simpler operation, and no capability that </w:t>
-      </w:r>
-      <w:proofErr w:type="spellStart"/>
-      <w:r>
-        <w:t>eClaims</w:t>
-      </w:r>
-      <w:proofErr w:type="spellEnd"/>
-      <w:r>
-        <w:t xml:space="preserve"> needs and ECS lacks. EKS wins on portability and on control, which </w:t>
-      </w:r>
-      <w:r>
-        <w:lastRenderedPageBreak/>
-        <w:t>is consistent with the main comparison in Section 4.2 — the same trade-off appears at both levels of the decision, and is resolved the same way for the same reason.</w:t>
-      </w:r>
-    </w:p>
-    <w:p>
-      <w:pPr>
-        <w:pStyle w:val="Body"/>
-      </w:pPr>
-      <w:r>
-        <w:t xml:space="preserve">The cost comparison is made on Fargate capacity, which both services support. Fargate bills ECS tasks and EKS pods at the same per-vCPU and per-GB rates, so the compute term is identical. The difference </w:t>
-      </w:r>
-      <w:proofErr w:type="gramStart"/>
-      <w:r>
-        <w:t>reduces</w:t>
-      </w:r>
-      <w:proofErr w:type="gramEnd"/>
-      <w:r>
-        <w:t xml:space="preserve"> to two items. The first is the EKS control-plane charge of USD 0.10 per cluster-hour: approximately USD 73 per cluster per month, or USD 292 across development, staging, production and the us-east-2 standby, which ECS does not charge at all. The second is the effort of keeping each cluster on a supported Kubernetes version, which Section 4.2 of the companion DAR quantifies. The companion DAR also shows that the Portability weight would have to exceed 12, against its current 5, for EKS to overtake ECS. It also sets out the</w:t>
-      </w:r>
-      <w:r>
-        <w:t xml:space="preserve"> </w:t>
-      </w:r>
-      <w:proofErr w:type="gramStart"/>
-      <w:r>
-        <w:t>on-premise</w:t>
-      </w:r>
-      <w:proofErr w:type="gramEnd"/>
-      <w:r>
-        <w:t xml:space="preserve"> path through Kubernetes.</w:t>
+        <w:t xml:space="preserve"/>
+      </w:r>
+      <w:r>
+        <w:t/>
       </w:r>
     </w:p>
     <w:p>

</xml_diff>